<commit_message>
Sincronizza stato workspace da altre sessioni (email, riunioni, sales-marketing, automazione GitHub)
</commit_message>
<xml_diff>
--- a/Vita privata/Finanza personale/Pensione/Alleanza casetti investimenti/_analisi/Alleata_Previdenza_DOro_report.docx
+++ b/Vita privata/Finanza personale/Pensione/Alleanza casetti investimenti/_analisi/Alleata_Previdenza_DOro_report.docx
@@ -738,7 +738,7 @@
           <w:b w:val="0"/>
           <w:i w:val="0"/>
         </w:rPr>
-        <w:t xml:space="preserve">: a 67 anni puoi prendere il 100% in capitale solo se la posizione resta sotto ~€100.000 (soglia stimata da Alleanza). Continuando a versare €5.000/anno, la superi già nel 2031 — ma il diritto di chiedere qualsiasi liquidazione scatta </w:t>
+        <w:t xml:space="preserve">: a 67 anni puoi prendere il 100% in capitale solo se la posizione resta sotto ~€100.000 (soglia stimata da Alleanza, che secondo Casetti può muoversi nel tempo). Continuando a versare €5.000/anno, la superi già nel 2031 — ma il diritto di chiedere qualsiasi liquidazione scatta </w:t>
       </w:r>
       <w:r>
         <w:rPr>
@@ -752,21 +752,365 @@
           <w:b w:val="0"/>
           <w:i w:val="0"/>
         </w:rPr>
-        <w:t xml:space="preserve">, non quando la posizione tocca €100.000 lungo il percorso. Per restare sotto soglia a 67 anni serve fermarsi con i versamenti nel </w:t>
+        <w:t xml:space="preserve"> (confermato per iscritto da Casetti il 15/07/2026), non quando la posizione tocca €100.000 lungo il percorso. Non conta *quando* superi la soglia, conta solo il valore </w:t>
       </w:r>
       <w:r>
         <w:rPr>
           <w:b/>
           <w:i w:val="0"/>
         </w:rPr>
-        <w:t>2026-2027</w:t>
+        <w:t>a 67 anni</w:t>
       </w:r>
       <w:r>
         <w:rPr>
           <w:b w:val="0"/>
           <w:i w:val="0"/>
         </w:rPr>
-        <w:t>.</w:t>
+        <w:t xml:space="preserve">. Casetti ha anche segnalato una possibile novità normativa: il tetto di capitale liquidabile potrebbe essere salito dal 50% al </w:t>
+      </w:r>
+      <w:r>
+        <w:rPr>
+          <w:b/>
+          <w:i w:val="0"/>
+        </w:rPr>
+        <w:t>60%</w:t>
+      </w:r>
+      <w:r>
+        <w:rPr>
+          <w:b w:val="0"/>
+          <w:i w:val="0"/>
+        </w:rPr>
+        <w:t xml:space="preserve"> (40% obbligatorio in rendita) — da verificare quale si applica al tuo caso.</w:t>
+      </w:r>
+    </w:p>
+    <w:p>
+      <w:pPr>
+        <w:spacing w:after="40"/>
+      </w:pPr>
+      <w:r>
+        <w:rPr>
+          <w:b/>
+          <w:color w:val="5A6270"/>
+          <w:sz w:val="17"/>
+        </w:rPr>
+        <w:t>SCENARI DI STOP DEI VERSAMENTI — PROIEZIONE A 67 ANNI (SOLO RIVALUTAZIONE, 1,4%/ANNO NETTO)</w:t>
+      </w:r>
+    </w:p>
+    <w:tbl>
+      <w:tblPr>
+        <w:tblStyle w:val="TableGrid"/>
+        <w:tblW w:type="auto" w:w="0"/>
+        <w:jc w:val="center"/>
+        <w:tblLook w:firstColumn="1" w:firstRow="1" w:lastColumn="0" w:lastRow="0" w:noHBand="0" w:noVBand="1" w:val="04A0"/>
+      </w:tblPr>
+      <w:tblGrid>
+        <w:gridCol w:w="2160"/>
+        <w:gridCol w:w="2160"/>
+        <w:gridCol w:w="2160"/>
+        <w:gridCol w:w="2160"/>
+      </w:tblGrid>
+      <w:tr>
+        <w:tc>
+          <w:tcPr>
+            <w:tcW w:type="dxa" w:w="2160"/>
+            <w:shd w:val="clear" w:color="auto" w:fill="E8E4D6"/>
+          </w:tcPr>
+          <w:p>
+            <w:r>
+              <w:rPr>
+                <w:b/>
+                <w:color w:val="5A6270"/>
+                <w:sz w:val="18"/>
+              </w:rPr>
+              <w:t>Fermarsi a fine</w:t>
+            </w:r>
+          </w:p>
+        </w:tc>
+        <w:tc>
+          <w:tcPr>
+            <w:tcW w:type="dxa" w:w="2160"/>
+            <w:shd w:val="clear" w:color="auto" w:fill="E8E4D6"/>
+          </w:tcPr>
+          <w:p>
+            <w:pPr>
+              <w:jc w:val="right"/>
+            </w:pPr>
+            <w:r>
+              <w:rPr>
+                <w:b/>
+                <w:color w:val="5A6270"/>
+                <w:sz w:val="18"/>
+              </w:rPr>
+              <w:t>Posizione al momento dello stop</w:t>
+            </w:r>
+          </w:p>
+        </w:tc>
+        <w:tc>
+          <w:tcPr>
+            <w:tcW w:type="dxa" w:w="2160"/>
+            <w:shd w:val="clear" w:color="auto" w:fill="E8E4D6"/>
+          </w:tcPr>
+          <w:p>
+            <w:pPr>
+              <w:jc w:val="right"/>
+            </w:pPr>
+            <w:r>
+              <w:rPr>
+                <w:b/>
+                <w:color w:val="5A6270"/>
+                <w:sz w:val="18"/>
+              </w:rPr>
+              <w:t>Proiezione a 67 anni</w:t>
+            </w:r>
+          </w:p>
+        </w:tc>
+        <w:tc>
+          <w:tcPr>
+            <w:tcW w:type="dxa" w:w="2160"/>
+            <w:shd w:val="clear" w:color="auto" w:fill="E8E4D6"/>
+          </w:tcPr>
+          <w:p>
+            <w:pPr>
+              <w:jc w:val="right"/>
+            </w:pPr>
+            <w:r>
+              <w:rPr>
+                <w:b/>
+                <w:color w:val="5A6270"/>
+                <w:sz w:val="18"/>
+              </w:rPr>
+              <w:t>Esito</w:t>
+            </w:r>
+          </w:p>
+        </w:tc>
+      </w:tr>
+      <w:tr>
+        <w:tc>
+          <w:tcPr>
+            <w:tcW w:type="dxa" w:w="2160"/>
+          </w:tcPr>
+          <w:p>
+            <w:r>
+              <w:rPr>
+                <w:sz w:val="19"/>
+              </w:rPr>
+              <w:t>2026 (subito)</w:t>
+            </w:r>
+          </w:p>
+        </w:tc>
+        <w:tc>
+          <w:tcPr>
+            <w:tcW w:type="dxa" w:w="2160"/>
+          </w:tcPr>
+          <w:p>
+            <w:pPr>
+              <w:jc w:val="right"/>
+            </w:pPr>
+            <w:r>
+              <w:rPr>
+                <w:sz w:val="19"/>
+              </w:rPr>
+              <w:t>€73.930</w:t>
+            </w:r>
+          </w:p>
+        </w:tc>
+        <w:tc>
+          <w:tcPr>
+            <w:tcW w:type="dxa" w:w="2160"/>
+          </w:tcPr>
+          <w:p>
+            <w:pPr>
+              <w:jc w:val="right"/>
+            </w:pPr>
+            <w:r>
+              <w:rPr>
+                <w:sz w:val="19"/>
+              </w:rPr>
+              <w:t>≈ €91.100</w:t>
+            </w:r>
+          </w:p>
+        </w:tc>
+        <w:tc>
+          <w:tcPr>
+            <w:tcW w:type="dxa" w:w="2160"/>
+          </w:tcPr>
+          <w:p>
+            <w:pPr>
+              <w:jc w:val="right"/>
+            </w:pPr>
+            <w:r>
+              <w:rPr>
+                <w:b/>
+                <w:color w:val="2F6E52"/>
+                <w:sz w:val="19"/>
+              </w:rPr>
+              <w:t>Sotto soglia — margine ≈ €8.900</w:t>
+            </w:r>
+          </w:p>
+        </w:tc>
+      </w:tr>
+      <w:tr>
+        <w:tc>
+          <w:tcPr>
+            <w:tcW w:type="dxa" w:w="2160"/>
+            <w:shd w:val="clear" w:color="auto" w:fill="F5F3EC"/>
+          </w:tcPr>
+          <w:p>
+            <w:r>
+              <w:rPr>
+                <w:sz w:val="19"/>
+              </w:rPr>
+              <w:t>2027</w:t>
+            </w:r>
+          </w:p>
+        </w:tc>
+        <w:tc>
+          <w:tcPr>
+            <w:tcW w:type="dxa" w:w="2160"/>
+            <w:shd w:val="clear" w:color="auto" w:fill="F5F3EC"/>
+          </w:tcPr>
+          <w:p>
+            <w:pPr>
+              <w:jc w:val="right"/>
+            </w:pPr>
+            <w:r>
+              <w:rPr>
+                <w:sz w:val="19"/>
+              </w:rPr>
+              <w:t>€79.736</w:t>
+            </w:r>
+          </w:p>
+        </w:tc>
+        <w:tc>
+          <w:tcPr>
+            <w:tcW w:type="dxa" w:w="2160"/>
+            <w:shd w:val="clear" w:color="auto" w:fill="F5F3EC"/>
+          </w:tcPr>
+          <w:p>
+            <w:pPr>
+              <w:jc w:val="right"/>
+            </w:pPr>
+            <w:r>
+              <w:rPr>
+                <w:sz w:val="19"/>
+              </w:rPr>
+              <w:t>≈ €96.900</w:t>
+            </w:r>
+          </w:p>
+        </w:tc>
+        <w:tc>
+          <w:tcPr>
+            <w:tcW w:type="dxa" w:w="2160"/>
+            <w:shd w:val="clear" w:color="auto" w:fill="F5F3EC"/>
+          </w:tcPr>
+          <w:p>
+            <w:pPr>
+              <w:jc w:val="right"/>
+            </w:pPr>
+            <w:r>
+              <w:rPr>
+                <w:sz w:val="19"/>
+              </w:rPr>
+              <w:t>Sotto soglia — margine ≈ €3.100 (stretto)</w:t>
+            </w:r>
+          </w:p>
+        </w:tc>
+      </w:tr>
+      <w:tr>
+        <w:tc>
+          <w:tcPr>
+            <w:tcW w:type="dxa" w:w="2160"/>
+          </w:tcPr>
+          <w:p>
+            <w:r>
+              <w:rPr>
+                <w:sz w:val="19"/>
+              </w:rPr>
+              <w:t>2028</w:t>
+            </w:r>
+          </w:p>
+        </w:tc>
+        <w:tc>
+          <w:tcPr>
+            <w:tcW w:type="dxa" w:w="2160"/>
+          </w:tcPr>
+          <w:p>
+            <w:pPr>
+              <w:jc w:val="right"/>
+            </w:pPr>
+            <w:r>
+              <w:rPr>
+                <w:sz w:val="19"/>
+              </w:rPr>
+              <w:t>€85.623</w:t>
+            </w:r>
+          </w:p>
+        </w:tc>
+        <w:tc>
+          <w:tcPr>
+            <w:tcW w:type="dxa" w:w="2160"/>
+          </w:tcPr>
+          <w:p>
+            <w:pPr>
+              <w:jc w:val="right"/>
+            </w:pPr>
+            <w:r>
+              <w:rPr>
+                <w:sz w:val="19"/>
+              </w:rPr>
+              <w:t>≈ €102.600</w:t>
+            </w:r>
+          </w:p>
+        </w:tc>
+        <w:tc>
+          <w:tcPr>
+            <w:tcW w:type="dxa" w:w="2160"/>
+          </w:tcPr>
+          <w:p>
+            <w:pPr>
+              <w:jc w:val="right"/>
+            </w:pPr>
+            <w:r>
+              <w:rPr>
+                <w:b/>
+                <w:color w:val="8A3B32"/>
+                <w:sz w:val="19"/>
+              </w:rPr>
+              <w:t>Sopra soglia — punto di non ritorno superato</w:t>
+            </w:r>
+          </w:p>
+        </w:tc>
+      </w:tr>
+    </w:tbl>
+    <w:p>
+      <w:pPr>
+        <w:spacing w:after="80"/>
+      </w:pPr>
+    </w:p>
+    <w:p>
+      <w:pPr>
+        <w:spacing w:after="120"/>
+      </w:pPr>
+      <w:r>
+        <w:rPr>
+          <w:b w:val="0"/>
+          <w:i w:val="0"/>
+        </w:rPr>
+        <w:t xml:space="preserve">Il punto di non ritorno è tra fine 2027 e fine 2028: oltre quella data, anche fermandosi, la sola rivalutazione porterebbe comunque la posizione sopra €100.000 a 67 anni. Fermarsi </w:t>
+      </w:r>
+      <w:r>
+        <w:rPr>
+          <w:b/>
+          <w:i w:val="0"/>
+        </w:rPr>
+        <w:t>subito (2026)</w:t>
+      </w:r>
+      <w:r>
+        <w:rPr>
+          <w:b w:val="0"/>
+          <w:i w:val="0"/>
+        </w:rPr>
+        <w:t xml:space="preserve"> dà il margine di sicurezza più ampio contro imprevisti (rendimento più alto del previsto, o soglia che si abbassa nel tempo).</w:t>
       </w:r>
     </w:p>
     <w:p>
@@ -783,7 +1127,7 @@
         <w:rPr>
           <w:color w:val="1C2430"/>
         </w:rPr>
-        <w:t>Le tre opzioni a confronto</w:t>
+        <w:t>Le due opzioni a confronto</w:t>
       </w:r>
     </w:p>
     <w:p>
@@ -797,7 +1141,25 @@
           <w:color w:val="5A6270"/>
           <w:sz w:val="20"/>
         </w:rPr>
-        <w:t>Rendita vitalizia completa, contro le due strade per avere capitale libero. In tutti e tre gli scenari D'Oro resta acceso fino alla sua scadenza naturale (2040, €62.000 garantiti) — non conviene mai riscattarlo prima, perché quel valore include anche i premi ancora da versare, non solo la crescita.</w:t>
+        <w:t xml:space="preserve">Rendita vitalizia completa, contro il Percorso legale per avere capitale libero. L'ipotesi “Uscita 2030” è stata </w:t>
+      </w:r>
+      <w:r>
+        <w:rPr>
+          <w:b/>
+          <w:i/>
+          <w:color w:val="5A6270"/>
+          <w:sz w:val="20"/>
+        </w:rPr>
+        <w:t>esclusa</w:t>
+      </w:r>
+      <w:r>
+        <w:rPr>
+          <w:b w:val="0"/>
+          <w:i/>
+          <w:color w:val="5A6270"/>
+          <w:sz w:val="20"/>
+        </w:rPr>
+        <w:t>: Casetti ha confermato per iscritto che il diritto a richiedere capitale o rendita matura solo a 67 anni, quindi un prelievo pieno anticipato non è possibile. In entrambi gli scenari restanti D'Oro resta acceso fino alla sua scadenza naturale (2040, €62.000 garantiti) — non conviene mai riscattarlo prima, perché quel valore include anche i premi ancora da versare, non solo la crescita.</w:t>
       </w:r>
     </w:p>
     <w:p>
@@ -855,28 +1217,28 @@
           <w:b/>
           <w:i w:val="0"/>
         </w:rPr>
-        <w:t>Uscita 2030 (ipotetica)</w:t>
+        <w:t>Uscita 2030 (ESCLUSA)</w:t>
       </w:r>
       <w:r>
         <w:rPr>
           <w:b w:val="0"/>
           <w:i w:val="0"/>
         </w:rPr>
-        <w:t xml:space="preserve"> — continui a versare nel PIP fino al 2030 (posizione €97.646), poi ne ritiri l'intero importo — </w:t>
+        <w:t xml:space="preserve"> — prevedeva di continuare a versare nel PIP fino al 2030 (posizione €97.646) e poi ritirarne l'intero importo. Casetti ha confermato che il diritto a liquidazione matura solo a 67 anni: questa opzione </w:t>
       </w:r>
       <w:r>
         <w:rPr>
           <w:b/>
           <w:i w:val="0"/>
         </w:rPr>
-        <w:t>ipotesi non confermata</w:t>
+        <w:t>non è percorribile</w:t>
       </w:r>
       <w:r>
         <w:rPr>
           <w:b w:val="0"/>
           <w:i w:val="0"/>
         </w:rPr>
-        <w:t>, dipende dalla risposta di Alleanza sul prelievo anticipato. D'Oro resta comunque acceso fino al 2040 come nel percorso legale. Dal 2031 investi €2.500/anno in più (oltre al premio D'Oro) in un conto deposito.</w:t>
+        <w:t xml:space="preserve"> e resta qui solo come riferimento storico.</w:t>
       </w:r>
     </w:p>
     <w:p>
@@ -900,15 +1262,14 @@
         <w:tblLook w:firstColumn="1" w:firstRow="1" w:lastColumn="0" w:lastRow="0" w:noHBand="0" w:noVBand="1" w:val="04A0"/>
       </w:tblPr>
       <w:tblGrid>
-        <w:gridCol w:w="2160"/>
-        <w:gridCol w:w="2160"/>
-        <w:gridCol w:w="2160"/>
-        <w:gridCol w:w="2160"/>
+        <w:gridCol w:w="2880"/>
+        <w:gridCol w:w="2880"/>
+        <w:gridCol w:w="2880"/>
       </w:tblGrid>
       <w:tr>
         <w:tc>
           <w:tcPr>
-            <w:tcW w:type="dxa" w:w="2160"/>
+            <w:tcW w:type="dxa" w:w="2880"/>
             <w:shd w:val="clear" w:color="auto" w:fill="E8E4D6"/>
           </w:tcPr>
           <w:p>
@@ -924,7 +1285,7 @@
         </w:tc>
         <w:tc>
           <w:tcPr>
-            <w:tcW w:type="dxa" w:w="2160"/>
+            <w:tcW w:type="dxa" w:w="2880"/>
             <w:shd w:val="clear" w:color="auto" w:fill="E8E4D6"/>
           </w:tcPr>
           <w:p>
@@ -945,7 +1306,7 @@
         </w:tc>
         <w:tc>
           <w:tcPr>
-            <w:tcW w:type="dxa" w:w="2160"/>
+            <w:tcW w:type="dxa" w:w="2880"/>
             <w:shd w:val="clear" w:color="auto" w:fill="E8E4D6"/>
           </w:tcPr>
           <w:p>
@@ -960,28 +1321,7 @@
               </w:rPr>
               <w:t>Percorso legale</w:t>
               <w:br/>
-              <w:t>(fermi PIP 2027)</w:t>
-            </w:r>
-          </w:p>
-        </w:tc>
-        <w:tc>
-          <w:tcPr>
-            <w:tcW w:type="dxa" w:w="2160"/>
-            <w:shd w:val="clear" w:color="auto" w:fill="E8E4D6"/>
-          </w:tcPr>
-          <w:p>
-            <w:pPr>
-              <w:jc w:val="right"/>
-            </w:pPr>
-            <w:r>
-              <w:rPr>
-                <w:b/>
-                <w:color w:val="5A6270"/>
-                <w:sz w:val="18"/>
-              </w:rPr>
-              <w:t>Uscita 2030</w:t>
-              <w:br/>
-              <w:t>(ipotetica)</w:t>
+              <w:t>(fermi PIP 2026-2027)</w:t>
             </w:r>
           </w:p>
         </w:tc>
@@ -989,7 +1329,7 @@
       <w:tr>
         <w:tc>
           <w:tcPr>
-            <w:tcW w:type="dxa" w:w="2160"/>
+            <w:tcW w:type="dxa" w:w="2880"/>
           </w:tcPr>
           <w:p>
             <w:r>
@@ -1002,7 +1342,7 @@
         </w:tc>
         <w:tc>
           <w:tcPr>
-            <w:tcW w:type="dxa" w:w="2160"/>
+            <w:tcW w:type="dxa" w:w="2880"/>
           </w:tcPr>
           <w:p>
             <w:pPr>
@@ -1018,7 +1358,7 @@
         </w:tc>
         <w:tc>
           <w:tcPr>
-            <w:tcW w:type="dxa" w:w="2160"/>
+            <w:tcW w:type="dxa" w:w="2880"/>
           </w:tcPr>
           <w:p>
             <w:pPr>
@@ -1028,23 +1368,7 @@
               <w:rPr>
                 <w:sz w:val="19"/>
               </w:rPr>
-              <w:t>€199.400 capitale</w:t>
-            </w:r>
-          </w:p>
-        </w:tc>
-        <w:tc>
-          <w:tcPr>
-            <w:tcW w:type="dxa" w:w="2160"/>
-          </w:tcPr>
-          <w:p>
-            <w:pPr>
-              <w:jc w:val="right"/>
-            </w:pPr>
-            <w:r>
-              <w:rPr>
-                <w:sz w:val="19"/>
-              </w:rPr>
-              <w:t>€216.800 capitale</w:t>
+              <w:t>€199.400 capitale (o ~€191.100 se ti fermi nel 2026, v. §1)</w:t>
             </w:r>
           </w:p>
         </w:tc>
@@ -1052,7 +1376,7 @@
       <w:tr>
         <w:tc>
           <w:tcPr>
-            <w:tcW w:type="dxa" w:w="2160"/>
+            <w:tcW w:type="dxa" w:w="2880"/>
             <w:shd w:val="clear" w:color="auto" w:fill="F5F3EC"/>
           </w:tcPr>
           <w:p>
@@ -1066,7 +1390,7 @@
         </w:tc>
         <w:tc>
           <w:tcPr>
-            <w:tcW w:type="dxa" w:w="2160"/>
+            <w:tcW w:type="dxa" w:w="2880"/>
             <w:shd w:val="clear" w:color="auto" w:fill="F5F3EC"/>
           </w:tcPr>
           <w:p>
@@ -1083,7 +1407,7 @@
         </w:tc>
         <w:tc>
           <w:tcPr>
-            <w:tcW w:type="dxa" w:w="2160"/>
+            <w:tcW w:type="dxa" w:w="2880"/>
             <w:shd w:val="clear" w:color="auto" w:fill="F5F3EC"/>
           </w:tcPr>
           <w:p>
@@ -1098,28 +1422,11 @@
             </w:r>
           </w:p>
         </w:tc>
-        <w:tc>
-          <w:tcPr>
-            <w:tcW w:type="dxa" w:w="2160"/>
-            <w:shd w:val="clear" w:color="auto" w:fill="F5F3EC"/>
-          </w:tcPr>
-          <w:p>
-            <w:pPr>
-              <w:jc w:val="right"/>
-            </w:pPr>
-            <w:r>
-              <w:rPr>
-                <w:sz w:val="19"/>
-              </w:rPr>
-              <w:t>~99 anni</w:t>
-            </w:r>
-          </w:p>
-        </w:tc>
       </w:tr>
       <w:tr>
         <w:tc>
           <w:tcPr>
-            <w:tcW w:type="dxa" w:w="2160"/>
+            <w:tcW w:type="dxa" w:w="2880"/>
           </w:tcPr>
           <w:p>
             <w:r>
@@ -1132,7 +1439,7 @@
         </w:tc>
         <w:tc>
           <w:tcPr>
-            <w:tcW w:type="dxa" w:w="2160"/>
+            <w:tcW w:type="dxa" w:w="2880"/>
           </w:tcPr>
           <w:p>
             <w:pPr>
@@ -1148,7 +1455,7 @@
         </w:tc>
         <w:tc>
           <w:tcPr>
-            <w:tcW w:type="dxa" w:w="2160"/>
+            <w:tcW w:type="dxa" w:w="2880"/>
           </w:tcPr>
           <w:p>
             <w:pPr>
@@ -1162,27 +1469,11 @@
             </w:r>
           </w:p>
         </w:tc>
-        <w:tc>
-          <w:tcPr>
-            <w:tcW w:type="dxa" w:w="2160"/>
-          </w:tcPr>
-          <w:p>
-            <w:pPr>
-              <w:jc w:val="right"/>
-            </w:pPr>
-            <w:r>
-              <w:rPr>
-                <w:sz w:val="19"/>
-              </w:rPr>
-              <w:t>~111 anni</w:t>
-            </w:r>
-          </w:p>
-        </w:tc>
       </w:tr>
       <w:tr>
         <w:tc>
           <w:tcPr>
-            <w:tcW w:type="dxa" w:w="2160"/>
+            <w:tcW w:type="dxa" w:w="2880"/>
             <w:shd w:val="clear" w:color="auto" w:fill="F5F3EC"/>
           </w:tcPr>
           <w:p>
@@ -1196,7 +1487,7 @@
         </w:tc>
         <w:tc>
           <w:tcPr>
-            <w:tcW w:type="dxa" w:w="2160"/>
+            <w:tcW w:type="dxa" w:w="2880"/>
             <w:shd w:val="clear" w:color="auto" w:fill="F5F3EC"/>
           </w:tcPr>
           <w:p>
@@ -1213,7 +1504,7 @@
         </w:tc>
         <w:tc>
           <w:tcPr>
-            <w:tcW w:type="dxa" w:w="2160"/>
+            <w:tcW w:type="dxa" w:w="2880"/>
             <w:shd w:val="clear" w:color="auto" w:fill="F5F3EC"/>
           </w:tcPr>
           <w:p>
@@ -1224,24 +1515,7 @@
               <w:rPr>
                 <w:sz w:val="19"/>
               </w:rPr>
-              <w:t>2027</w:t>
-            </w:r>
-          </w:p>
-        </w:tc>
-        <w:tc>
-          <w:tcPr>
-            <w:tcW w:type="dxa" w:w="2160"/>
-            <w:shd w:val="clear" w:color="auto" w:fill="F5F3EC"/>
-          </w:tcPr>
-          <w:p>
-            <w:pPr>
-              <w:jc w:val="right"/>
-            </w:pPr>
-            <w:r>
-              <w:rPr>
-                <w:sz w:val="19"/>
-              </w:rPr>
-              <w:t>2030</w:t>
+              <w:t>2026 o 2027 (a seconda di quando ti fermi)</w:t>
             </w:r>
           </w:p>
         </w:tc>
@@ -1249,7 +1523,7 @@
       <w:tr>
         <w:tc>
           <w:tcPr>
-            <w:tcW w:type="dxa" w:w="2160"/>
+            <w:tcW w:type="dxa" w:w="2880"/>
           </w:tcPr>
           <w:p>
             <w:r>
@@ -1262,7 +1536,7 @@
         </w:tc>
         <w:tc>
           <w:tcPr>
-            <w:tcW w:type="dxa" w:w="2160"/>
+            <w:tcW w:type="dxa" w:w="2880"/>
           </w:tcPr>
           <w:p>
             <w:pPr>
@@ -1278,23 +1552,7 @@
         </w:tc>
         <w:tc>
           <w:tcPr>
-            <w:tcW w:type="dxa" w:w="2160"/>
-          </w:tcPr>
-          <w:p>
-            <w:pPr>
-              <w:jc w:val="right"/>
-            </w:pPr>
-            <w:r>
-              <w:rPr>
-                <w:sz w:val="19"/>
-              </w:rPr>
-              <w:t>Sì, per intero</w:t>
-            </w:r>
-          </w:p>
-        </w:tc>
-        <w:tc>
-          <w:tcPr>
-            <w:tcW w:type="dxa" w:w="2160"/>
+            <w:tcW w:type="dxa" w:w="2880"/>
           </w:tcPr>
           <w:p>
             <w:pPr>
@@ -1312,7 +1570,7 @@
       <w:tr>
         <w:tc>
           <w:tcPr>
-            <w:tcW w:type="dxa" w:w="2160"/>
+            <w:tcW w:type="dxa" w:w="2880"/>
             <w:shd w:val="clear" w:color="auto" w:fill="F5F3EC"/>
           </w:tcPr>
           <w:p>
@@ -1326,7 +1584,7 @@
         </w:tc>
         <w:tc>
           <w:tcPr>
-            <w:tcW w:type="dxa" w:w="2160"/>
+            <w:tcW w:type="dxa" w:w="2880"/>
             <w:shd w:val="clear" w:color="auto" w:fill="F5F3EC"/>
           </w:tcPr>
           <w:p>
@@ -1343,7 +1601,7 @@
         </w:tc>
         <w:tc>
           <w:tcPr>
-            <w:tcW w:type="dxa" w:w="2160"/>
+            <w:tcW w:type="dxa" w:w="2880"/>
             <w:shd w:val="clear" w:color="auto" w:fill="F5F3EC"/>
           </w:tcPr>
           <w:p>
@@ -1358,28 +1616,11 @@
             </w:r>
           </w:p>
         </w:tc>
-        <w:tc>
-          <w:tcPr>
-            <w:tcW w:type="dxa" w:w="2160"/>
-            <w:shd w:val="clear" w:color="auto" w:fill="F5F3EC"/>
-          </w:tcPr>
-          <w:p>
-            <w:pPr>
-              <w:jc w:val="right"/>
-            </w:pPr>
-            <w:r>
-              <w:rPr>
-                <w:sz w:val="19"/>
-              </w:rPr>
-              <w:t>Sì — non confermato</w:t>
-            </w:r>
-          </w:p>
-        </w:tc>
       </w:tr>
       <w:tr>
         <w:tc>
           <w:tcPr>
-            <w:tcW w:type="dxa" w:w="2160"/>
+            <w:tcW w:type="dxa" w:w="2880"/>
           </w:tcPr>
           <w:p>
             <w:r>
@@ -1392,7 +1633,7 @@
         </w:tc>
         <w:tc>
           <w:tcPr>
-            <w:tcW w:type="dxa" w:w="2160"/>
+            <w:tcW w:type="dxa" w:w="2880"/>
           </w:tcPr>
           <w:p>
             <w:pPr>
@@ -1408,7 +1649,7 @@
         </w:tc>
         <w:tc>
           <w:tcPr>
-            <w:tcW w:type="dxa" w:w="2160"/>
+            <w:tcW w:type="dxa" w:w="2880"/>
           </w:tcPr>
           <w:p>
             <w:pPr>
@@ -1418,23 +1659,7 @@
               <w:rPr>
                 <w:sz w:val="19"/>
               </w:rPr>
-              <w:t>€7.500 fino al 2027 (di cui ~€2.150/anno restituiti da 730), poi €5.000 fino al 2040</w:t>
-            </w:r>
-          </w:p>
-        </w:tc>
-        <w:tc>
-          <w:tcPr>
-            <w:tcW w:type="dxa" w:w="2160"/>
-          </w:tcPr>
-          <w:p>
-            <w:pPr>
-              <w:jc w:val="right"/>
-            </w:pPr>
-            <w:r>
-              <w:rPr>
-                <w:sz w:val="19"/>
-              </w:rPr>
-              <w:t>€7.500 fino al 2030 (di cui ~€2.150/anno restituiti da 730), poi €5.000 fino al 2040</w:t>
+              <w:t>€7.500 fino allo stop (di cui ~€2.150/anno restituiti da deduzione), poi €5.000 fino al 2040</w:t>
             </w:r>
           </w:p>
         </w:tc>
@@ -1641,7 +1866,7 @@
               <w:rPr>
                 <w:sz w:val="19"/>
               </w:rPr>
-              <w:t>€2.500/anno risparmiati in conto deposito dal 2028 al 2041 (14 anni, al 2,2%)</w:t>
+              <w:t>€2.500/anno risparmiati dal 2028 al 2041 (14 anni, al 2,2% netto medio — non esistono conti deposito con vincolo unico così lungo: serve una serie di depositi scaglionati/rinnovati ogni 2-5 anni, non un unico conto a 14 anni)</w:t>
             </w:r>
           </w:p>
         </w:tc>
@@ -1738,286 +1963,17 @@
     </w:p>
     <w:p>
       <w:pPr>
-        <w:spacing w:after="40"/>
+        <w:spacing w:after="200"/>
       </w:pPr>
       <w:r>
         <w:rPr>
-          <w:b/>
+          <w:b w:val="0"/>
+          <w:i w:val="0"/>
           <w:color w:val="5A6270"/>
           <w:sz w:val="17"/>
         </w:rPr>
-        <w:t>USCITA 2030 (IPOTETICA) — €216.800</w:t>
+        <w:t>Nota: la tabella “Uscita 2030” (€216.800) presente nelle versioni precedenti di questo documento è stata rimossa — Casetti ha confermato che il prelievo pieno anticipato non è possibile, quindi quello scenario non è più percorribile.</w:t>
       </w:r>
-    </w:p>
-    <w:tbl>
-      <w:tblPr>
-        <w:tblStyle w:val="TableGrid"/>
-        <w:tblW w:type="auto" w:w="0"/>
-        <w:jc w:val="center"/>
-        <w:tblLook w:firstColumn="1" w:firstRow="1" w:lastColumn="0" w:lastRow="0" w:noHBand="0" w:noVBand="1" w:val="04A0"/>
-      </w:tblPr>
-      <w:tblGrid>
-        <w:gridCol w:w="2880"/>
-        <w:gridCol w:w="2880"/>
-        <w:gridCol w:w="2880"/>
-      </w:tblGrid>
-      <w:tr>
-        <w:tc>
-          <w:tcPr>
-            <w:tcW w:type="dxa" w:w="2880"/>
-            <w:shd w:val="clear" w:color="auto" w:fill="E8E4D6"/>
-          </w:tcPr>
-          <w:p>
-            <w:r>
-              <w:rPr>
-                <w:b/>
-                <w:color w:val="5A6270"/>
-                <w:sz w:val="18"/>
-              </w:rPr>
-              <w:t>Componente</w:t>
-            </w:r>
-          </w:p>
-        </w:tc>
-        <w:tc>
-          <w:tcPr>
-            <w:tcW w:type="dxa" w:w="2880"/>
-            <w:shd w:val="clear" w:color="auto" w:fill="E8E4D6"/>
-          </w:tcPr>
-          <w:p>
-            <w:pPr>
-              <w:jc w:val="right"/>
-            </w:pPr>
-            <w:r>
-              <w:rPr>
-                <w:b/>
-                <w:color w:val="5A6270"/>
-                <w:sz w:val="18"/>
-              </w:rPr>
-              <w:t>Valore a 67 anni</w:t>
-            </w:r>
-          </w:p>
-        </w:tc>
-        <w:tc>
-          <w:tcPr>
-            <w:tcW w:type="dxa" w:w="2880"/>
-            <w:shd w:val="clear" w:color="auto" w:fill="E8E4D6"/>
-          </w:tcPr>
-          <w:p>
-            <w:pPr>
-              <w:jc w:val="right"/>
-            </w:pPr>
-            <w:r>
-              <w:rPr>
-                <w:b/>
-                <w:color w:val="5A6270"/>
-                <w:sz w:val="18"/>
-              </w:rPr>
-              <w:t>% del totale</w:t>
-            </w:r>
-          </w:p>
-        </w:tc>
-      </w:tr>
-      <w:tr>
-        <w:tc>
-          <w:tcPr>
-            <w:tcW w:type="dxa" w:w="2880"/>
-          </w:tcPr>
-          <w:p>
-            <w:r>
-              <w:rPr>
-                <w:sz w:val="19"/>
-              </w:rPr>
-              <w:t>PIP ritirato nel 2030 (€97.646), investito 11 anni al 2,2%</w:t>
-            </w:r>
-          </w:p>
-        </w:tc>
-        <w:tc>
-          <w:tcPr>
-            <w:tcW w:type="dxa" w:w="2880"/>
-          </w:tcPr>
-          <w:p>
-            <w:pPr>
-              <w:jc w:val="right"/>
-            </w:pPr>
-            <w:r>
-              <w:rPr>
-                <w:sz w:val="19"/>
-              </w:rPr>
-              <w:t>€124.100</w:t>
-            </w:r>
-          </w:p>
-        </w:tc>
-        <w:tc>
-          <w:tcPr>
-            <w:tcW w:type="dxa" w:w="2880"/>
-          </w:tcPr>
-          <w:p>
-            <w:pPr>
-              <w:jc w:val="right"/>
-            </w:pPr>
-            <w:r>
-              <w:rPr>
-                <w:sz w:val="19"/>
-              </w:rPr>
-              <w:t>57%</w:t>
-            </w:r>
-          </w:p>
-        </w:tc>
-      </w:tr>
-      <w:tr>
-        <w:tc>
-          <w:tcPr>
-            <w:tcW w:type="dxa" w:w="2880"/>
-            <w:shd w:val="clear" w:color="auto" w:fill="F5F3EC"/>
-          </w:tcPr>
-          <w:p>
-            <w:r>
-              <w:rPr>
-                <w:sz w:val="19"/>
-              </w:rPr>
-              <w:t>D'Oro tenuto a scadenza 2040 (capitale minimo garantito, invariato)</w:t>
-            </w:r>
-          </w:p>
-        </w:tc>
-        <w:tc>
-          <w:tcPr>
-            <w:tcW w:type="dxa" w:w="2880"/>
-            <w:shd w:val="clear" w:color="auto" w:fill="F5F3EC"/>
-          </w:tcPr>
-          <w:p>
-            <w:pPr>
-              <w:jc w:val="right"/>
-            </w:pPr>
-            <w:r>
-              <w:rPr>
-                <w:sz w:val="19"/>
-              </w:rPr>
-              <w:t>€62.000</w:t>
-            </w:r>
-          </w:p>
-        </w:tc>
-        <w:tc>
-          <w:tcPr>
-            <w:tcW w:type="dxa" w:w="2880"/>
-            <w:shd w:val="clear" w:color="auto" w:fill="F5F3EC"/>
-          </w:tcPr>
-          <w:p>
-            <w:pPr>
-              <w:jc w:val="right"/>
-            </w:pPr>
-            <w:r>
-              <w:rPr>
-                <w:sz w:val="19"/>
-              </w:rPr>
-              <w:t>29%</w:t>
-            </w:r>
-          </w:p>
-        </w:tc>
-      </w:tr>
-      <w:tr>
-        <w:tc>
-          <w:tcPr>
-            <w:tcW w:type="dxa" w:w="2880"/>
-          </w:tcPr>
-          <w:p>
-            <w:r>
-              <w:rPr>
-                <w:sz w:val="19"/>
-              </w:rPr>
-              <w:t>€2.500/anno investiti dal 2031 al 2041 (11 anni, al 2,2%)</w:t>
-            </w:r>
-          </w:p>
-        </w:tc>
-        <w:tc>
-          <w:tcPr>
-            <w:tcW w:type="dxa" w:w="2880"/>
-          </w:tcPr>
-          <w:p>
-            <w:pPr>
-              <w:jc w:val="right"/>
-            </w:pPr>
-            <w:r>
-              <w:rPr>
-                <w:sz w:val="19"/>
-              </w:rPr>
-              <w:t>€30.700</w:t>
-            </w:r>
-          </w:p>
-        </w:tc>
-        <w:tc>
-          <w:tcPr>
-            <w:tcW w:type="dxa" w:w="2880"/>
-          </w:tcPr>
-          <w:p>
-            <w:pPr>
-              <w:jc w:val="right"/>
-            </w:pPr>
-            <w:r>
-              <w:rPr>
-                <w:sz w:val="19"/>
-              </w:rPr>
-              <w:t>14%</w:t>
-            </w:r>
-          </w:p>
-        </w:tc>
-      </w:tr>
-      <w:tr>
-        <w:tc>
-          <w:tcPr>
-            <w:tcW w:type="dxa" w:w="2880"/>
-            <w:shd w:val="clear" w:color="auto" w:fill="F5F3EC"/>
-          </w:tcPr>
-          <w:p>
-            <w:r>
-              <w:rPr>
-                <w:sz w:val="19"/>
-              </w:rPr>
-              <w:t>Totale a 67 anni</w:t>
-            </w:r>
-          </w:p>
-        </w:tc>
-        <w:tc>
-          <w:tcPr>
-            <w:tcW w:type="dxa" w:w="2880"/>
-            <w:shd w:val="clear" w:color="auto" w:fill="F5F3EC"/>
-          </w:tcPr>
-          <w:p>
-            <w:pPr>
-              <w:jc w:val="right"/>
-            </w:pPr>
-            <w:r>
-              <w:rPr>
-                <w:b/>
-                <w:color w:val="9A6B2C"/>
-                <w:sz w:val="19"/>
-              </w:rPr>
-              <w:t>€216.800</w:t>
-            </w:r>
-          </w:p>
-        </w:tc>
-        <w:tc>
-          <w:tcPr>
-            <w:tcW w:type="dxa" w:w="2880"/>
-            <w:shd w:val="clear" w:color="auto" w:fill="F5F3EC"/>
-          </w:tcPr>
-          <w:p>
-            <w:pPr>
-              <w:jc w:val="right"/>
-            </w:pPr>
-            <w:r>
-              <w:rPr>
-                <w:sz w:val="19"/>
-              </w:rPr>
-              <w:t>100%</w:t>
-            </w:r>
-          </w:p>
-        </w:tc>
-      </w:tr>
-    </w:tbl>
-    <w:p>
-      <w:pPr>
-        <w:spacing w:after="80"/>
-      </w:pPr>
     </w:p>
     <w:tbl>
       <w:tblPr>
@@ -2056,7 +2012,7 @@
                 <w:b w:val="0"/>
                 <w:i w:val="0"/>
               </w:rPr>
-              <w:t xml:space="preserve">A parità di soldi versati, riscattare D'Oro nel 2030 (~€35.000) e investire anche i €2.500/anno successivi in conto deposito darebbe circa </w:t>
+              <w:t xml:space="preserve">A parità di soldi versati, riscattare D'Oro nel 2030 (~€35.000) e investire anche i €2.500/anno successivi (in una serie di conti deposito scaglionati/rinnovati, non un unico vincolo di 11 anni — non esistono conti deposito con durata così lunga) darebbe circa </w:t>
             </w:r>
             <w:r>
               <w:rPr>
@@ -2585,7 +2541,7 @@
                 <w:color w:val="9A6B2C"/>
                 <w:sz w:val="18"/>
               </w:rPr>
-              <w:t>1 — NESSUNA AZIONE RICHIESTA PRIMA DEL 2027</w:t>
+              <w:t>1 — DECISIONE PRESA: PERCORSO LEGALE, FERMARSI CON I VERSAMENTI PIP ENTRO IL 2026-2027</w:t>
             </w:r>
           </w:p>
           <w:p>
@@ -2597,7 +2553,21 @@
                 <w:b w:val="0"/>
                 <w:i w:val="0"/>
               </w:rPr>
-              <w:t>Continuare come oggi (€5.000 PIP + €2.500 D'Oro) è coerente con tutte le strade possibili almeno fino al 2026-2027.</w:t>
+              <w:t xml:space="preserve">L'ipotesi Uscita 2030 è esclusa (v. §2). Fermarsi </w:t>
+            </w:r>
+            <w:r>
+              <w:rPr>
+                <w:b/>
+                <w:i w:val="0"/>
+              </w:rPr>
+              <w:t>subito (2026)</w:t>
+            </w:r>
+            <w:r>
+              <w:rPr>
+                <w:b w:val="0"/>
+                <w:i w:val="0"/>
+              </w:rPr>
+              <w:t xml:space="preserve"> dà il margine di sicurezza più ampio (~€8.900 sotto soglia a 67 anni) contro imprevisti; aspettare fino al 2027 resta sicuro ma con margine più stretto (~€3.100). Oltre il 2027-2028 il punto di non ritorno è superato (v. §1).</w:t>
             </w:r>
           </w:p>
         </w:tc>
@@ -2633,7 +2603,7 @@
                 <w:color w:val="8A3B32"/>
                 <w:sz w:val="18"/>
               </w:rPr>
-              <w:t>2 — SERVONO DUE RISPOSTE SCRITTE DA CASETTI PRIMA DI DECIDERE</w:t>
+              <w:t>2 — RISPOSTE RICEVUTE DA CASETTI (15/07/2026)</w:t>
             </w:r>
           </w:p>
           <w:p>
@@ -2652,7 +2622,7 @@
                 <w:b w:val="0"/>
                 <w:i w:val="0"/>
               </w:rPr>
-              <w:t xml:space="preserve"> Il prelievo del 100% della posizione PIP sotto soglia è possibile solo a 67 anni, o anche prima se la posizione resta sotto €100.000? (Se sì → Uscita 2030, €216.800. Se no → Percorso legale, €199.400.)</w:t>
+              <w:t xml:space="preserve"> Confermato: il diritto a capitale/rendita matura solo a 67 anni, mai prima — Uscita 2030 esclusa.</w:t>
             </w:r>
           </w:p>
           <w:p>
@@ -2671,7 +2641,21 @@
                 <w:b w:val="0"/>
                 <w:i w:val="0"/>
               </w:rPr>
-              <w:t xml:space="preserve"> Una volta iniziata l'erogazione, la rendita resta fissa o si rivaluta nel tempo?</w:t>
+              <w:t xml:space="preserve"> Confermato che la rendita </w:t>
+            </w:r>
+            <w:r>
+              <w:rPr>
+                <w:b/>
+                <w:i w:val="0"/>
+              </w:rPr>
+              <w:t>si rivaluta</w:t>
+            </w:r>
+            <w:r>
+              <w:rPr>
+                <w:b w:val="0"/>
+                <w:i w:val="0"/>
+              </w:rPr>
+              <w:t xml:space="preserve"> nel tempo, ma senza specificare il meccanismo/indice.</w:t>
             </w:r>
           </w:p>
           <w:p>
@@ -2690,7 +2674,143 @@
                 <w:b w:val="0"/>
                 <w:i w:val="0"/>
               </w:rPr>
-              <w:t xml:space="preserve"> Qual è il coefficiente della rendita reversibile a favore di Megumi?</w:t>
+              <w:t xml:space="preserve"> Coefficiente di reversibilità per Megumi: </w:t>
+            </w:r>
+            <w:r>
+              <w:rPr>
+                <w:b/>
+                <w:i w:val="0"/>
+              </w:rPr>
+              <w:t>ancora non fornito</w:t>
+            </w:r>
+            <w:r>
+              <w:rPr>
+                <w:b w:val="0"/>
+                <w:i w:val="0"/>
+              </w:rPr>
+              <w:t xml:space="preserve"> — Casetti dice di aver bisogno di un'ipotesi di durata (fino a quando tu e poi Megumi percepireste la rendita) per calcolarlo.</w:t>
+            </w:r>
+          </w:p>
+          <w:p>
+            <w:pPr>
+              <w:spacing w:after="80" w:before="40"/>
+            </w:pPr>
+            <w:r>
+              <w:rPr>
+                <w:b w:val="0"/>
+                <w:i w:val="0"/>
+              </w:rPr>
+              <w:t xml:space="preserve">Informazione nuova non richiesta: il tetto di capitale liquidabile potrebbe essere salito dal 50% al </w:t>
+            </w:r>
+            <w:r>
+              <w:rPr>
+                <w:b/>
+                <w:i w:val="0"/>
+              </w:rPr>
+              <w:t>60%</w:t>
+            </w:r>
+            <w:r>
+              <w:rPr>
+                <w:b w:val="0"/>
+                <w:i w:val="0"/>
+              </w:rPr>
+              <w:t xml:space="preserve"> per una possibile novità di legge di bilancio — da confermare quale si applica al tuo caso.</w:t>
+            </w:r>
+          </w:p>
+        </w:tc>
+      </w:tr>
+    </w:tbl>
+    <w:p>
+      <w:pPr>
+        <w:spacing w:after="40"/>
+      </w:pPr>
+    </w:p>
+    <w:tbl>
+      <w:tblPr>
+        <w:tblW w:type="auto" w:w="0"/>
+        <w:jc w:val="center"/>
+        <w:tblLook w:firstColumn="1" w:firstRow="1" w:lastColumn="0" w:lastRow="0" w:noHBand="0" w:noVBand="1" w:val="04A0"/>
+      </w:tblPr>
+      <w:tblGrid>
+        <w:gridCol w:w="8640"/>
+      </w:tblGrid>
+      <w:tr>
+        <w:tc>
+          <w:tcPr>
+            <w:tcW w:type="dxa" w:w="8640"/>
+            <w:shd w:val="clear" w:color="auto" w:fill="F2E6E3"/>
+          </w:tcPr>
+          <w:p>
+            <w:pPr>
+              <w:spacing w:after="80" w:before="40"/>
+            </w:pPr>
+            <w:r>
+              <w:rPr>
+                <w:b/>
+                <w:color w:val="8A3B32"/>
+                <w:sz w:val="18"/>
+              </w:rPr>
+              <w:t>2BIS — DOMANDE ANCORA SENZA RISPOSTA NUMERICA, DA CHIUDERE NELL'INCONTRO DI PERSONA</w:t>
+            </w:r>
+          </w:p>
+          <w:p>
+            <w:pPr>
+              <w:spacing w:after="80" w:before="40"/>
+            </w:pPr>
+            <w:r>
+              <w:rPr>
+                <w:b w:val="0"/>
+                <w:i w:val="0"/>
+              </w:rPr>
+              <w:t>Rendita netta mensile reale a 67 anni (mai fornito un importo in euro).</w:t>
+            </w:r>
+          </w:p>
+          <w:p>
+            <w:pPr>
+              <w:spacing w:after="80" w:before="40"/>
+            </w:pPr>
+            <w:r>
+              <w:rPr>
+                <w:b w:val="0"/>
+                <w:i w:val="0"/>
+              </w:rPr>
+              <w:t>Importo netto per te e per Megumi con la reversibilità attiva.</w:t>
+            </w:r>
+          </w:p>
+          <w:p>
+            <w:pPr>
+              <w:spacing w:after="80" w:before="40"/>
+            </w:pPr>
+            <w:r>
+              <w:rPr>
+                <w:b w:val="0"/>
+                <w:i w:val="0"/>
+              </w:rPr>
+              <w:t>Perché il capitale minimo garantito D'Oro (€62.077,86) è inferiore alla somma dei premi attesi (€62.500) — nessuna spiegazione ricevuta.</w:t>
+            </w:r>
+          </w:p>
+          <w:p>
+            <w:pPr>
+              <w:spacing w:after="80" w:before="40"/>
+            </w:pPr>
+            <w:r>
+              <w:rPr>
+                <w:b w:val="0"/>
+                <w:i w:val="0"/>
+              </w:rPr>
+              <w:t>Scomposizione della perdita di €3.900 in caso di riscatto D'Oro (caricamenti / copertura / penale) e anno o valore in cui il riscatto tornerebbe in pareggio con i premi versati — ricevuta solo una spiegazione generale (l'uscita anticipata rispetto alla durata pattuita concentra i costi), nessun numero o data.</w:t>
+            </w:r>
+          </w:p>
+          <w:p>
+            <w:pPr>
+              <w:spacing w:after="80" w:before="40"/>
+            </w:pPr>
+            <w:r>
+              <w:rPr>
+                <w:b w:val="0"/>
+                <w:i w:val="0"/>
+              </w:rPr>
+              <w:t>Coefficiente di conversione corretto (4,19% vs 5,772% nel documento) e capitale minimo garantito a 67 anni sul PIP.</w:t>
             </w:r>
           </w:p>
         </w:tc>

</xml_diff>